<commit_message>
docs: adicionado modelos de visoes
</commit_message>
<xml_diff>
--- a/Docs/Modelagem de Análise/Visão de Interação com Usuário/Visão de Interação Find Collectors Vrs 1.0.docx
+++ b/Docs/Modelagem de Análise/Visão de Interação com Usuário/Visão de Interação Find Collectors Vrs 1.0.docx
@@ -1,6 +1,6 @@
 
 <file path=word/document.xml><?xml version="1.0" encoding="utf-8"?>
-<w:document xmlns:wpc="http://schemas.microsoft.com/office/word/2010/wordprocessingCanvas" xmlns:mc="http://schemas.openxmlformats.org/markup-compatibility/2006" xmlns:o="urn:schemas-microsoft-com:office:office" xmlns:r="http://schemas.openxmlformats.org/officeDocument/2006/relationships" xmlns:m="http://schemas.openxmlformats.org/officeDocument/2006/math" xmlns:v="urn:schemas-microsoft-com:vml" xmlns:wp14="http://schemas.microsoft.com/office/word/2010/wordprocessingDrawing" xmlns:wp="http://schemas.openxmlformats.org/drawingml/2006/wordprocessingDrawing" xmlns:w10="urn:schemas-microsoft-com:office:word" xmlns:w="http://schemas.openxmlformats.org/wordprocessingml/2006/main" xmlns:w14="http://schemas.microsoft.com/office/word/2010/wordml" xmlns:w15="http://schemas.microsoft.com/office/word/2012/wordml" xmlns:wpg="http://schemas.microsoft.com/office/word/2010/wordprocessingGroup" xmlns:wpi="http://schemas.microsoft.com/office/word/2010/wordprocessingInk" xmlns:wne="http://schemas.microsoft.com/office/word/2006/wordml" xmlns:wps="http://schemas.microsoft.com/office/word/2010/wordprocessingShape" mc:Ignorable="w14 w15 wp14">
+<w:document xmlns:wpc="http://schemas.microsoft.com/office/word/2010/wordprocessingCanvas" xmlns:cx="http://schemas.microsoft.com/office/drawing/2014/chartex" xmlns:cx1="http://schemas.microsoft.com/office/drawing/2015/9/8/chartex" xmlns:cx2="http://schemas.microsoft.com/office/drawing/2015/10/21/chartex" xmlns:cx3="http://schemas.microsoft.com/office/drawing/2016/5/9/chartex" xmlns:cx4="http://schemas.microsoft.com/office/drawing/2016/5/10/chartex" xmlns:cx5="http://schemas.microsoft.com/office/drawing/2016/5/11/chartex" xmlns:cx6="http://schemas.microsoft.com/office/drawing/2016/5/12/chartex" xmlns:cx7="http://schemas.microsoft.com/office/drawing/2016/5/13/chartex" xmlns:cx8="http://schemas.microsoft.com/office/drawing/2016/5/14/chartex" xmlns:mc="http://schemas.openxmlformats.org/markup-compatibility/2006" xmlns:aink="http://schemas.microsoft.com/office/drawing/2016/ink" xmlns:am3d="http://schemas.microsoft.com/office/drawing/2017/model3d" xmlns:o="urn:schemas-microsoft-com:office:office" xmlns:r="http://schemas.openxmlformats.org/officeDocument/2006/relationships" xmlns:m="http://schemas.openxmlformats.org/officeDocument/2006/math" xmlns:v="urn:schemas-microsoft-com:vml" xmlns:wp14="http://schemas.microsoft.com/office/word/2010/wordprocessingDrawing" xmlns:wp="http://schemas.openxmlformats.org/drawingml/2006/wordprocessingDrawing" xmlns:w10="urn:schemas-microsoft-com:office:word" xmlns:w="http://schemas.openxmlformats.org/wordprocessingml/2006/main" xmlns:w14="http://schemas.microsoft.com/office/word/2010/wordml" xmlns:w15="http://schemas.microsoft.com/office/word/2012/wordml" xmlns:w16cex="http://schemas.microsoft.com/office/word/2018/wordml/cex" xmlns:w16cid="http://schemas.microsoft.com/office/word/2016/wordml/cid" xmlns:w16="http://schemas.microsoft.com/office/word/2018/wordml" xmlns:w16sdtdh="http://schemas.microsoft.com/office/word/2020/wordml/sdtdatahash" xmlns:w16se="http://schemas.microsoft.com/office/word/2015/wordml/symex" xmlns:wpg="http://schemas.microsoft.com/office/word/2010/wordprocessingGroup" xmlns:wpi="http://schemas.microsoft.com/office/word/2010/wordprocessingInk" xmlns:wne="http://schemas.microsoft.com/office/word/2006/wordml" xmlns:wps="http://schemas.microsoft.com/office/word/2010/wordprocessingShape" mc:Ignorable="w14 w15 w16se w16cid w16 w16cex w16sdtdh wp14">
   <w:body>
     <w:p>
       <w:pPr>
@@ -77,7 +77,8 @@
         <w:pStyle w:val="Ttulo1"/>
       </w:pPr>
       <w:r>
-        <w:t>Nome do projeto</w:t>
+        <w:lastRenderedPageBreak/>
+        <w:t>FIND COLLECTORS</w:t>
       </w:r>
     </w:p>
     <w:p>
@@ -85,36 +86,188 @@
         <w:pStyle w:val="Ttulo2"/>
       </w:pPr>
       <w:r>
-        <w:t>Caso de uso &lt;NOME&gt;</w:t>
+        <w:t xml:space="preserve">Caso de uso </w:t>
+      </w:r>
+      <w:r>
+        <w:t>visão geral</w:t>
+      </w:r>
+    </w:p>
+    <w:p>
+      <w:r>
+        <w:rPr>
+          <w:noProof/>
+        </w:rPr>
+        <w:drawing>
+          <wp:inline distT="0" distB="0" distL="0" distR="0" wp14:anchorId="4741877C" wp14:editId="2E9E98D2">
+            <wp:extent cx="5431790" cy="4972050"/>
+            <wp:effectExtent l="0" t="0" r="0" b="0"/>
+            <wp:docPr id="3" name="Imagem 3"/>
+            <wp:cNvGraphicFramePr>
+              <a:graphicFrameLocks xmlns:a="http://schemas.openxmlformats.org/drawingml/2006/main" noChangeAspect="1"/>
+            </wp:cNvGraphicFramePr>
+            <a:graphic xmlns:a="http://schemas.openxmlformats.org/drawingml/2006/main">
+              <a:graphicData uri="http://schemas.openxmlformats.org/drawingml/2006/picture">
+                <pic:pic xmlns:pic="http://schemas.openxmlformats.org/drawingml/2006/picture">
+                  <pic:nvPicPr>
+                    <pic:cNvPr id="3" name="Imagem 3"/>
+                    <pic:cNvPicPr/>
+                  </pic:nvPicPr>
+                  <pic:blipFill>
+                    <a:blip r:embed="rId9">
+                      <a:extLst>
+                        <a:ext uri="{28A0092B-C50C-407E-A947-70E740481C1C}">
+                          <a14:useLocalDpi xmlns:a14="http://schemas.microsoft.com/office/drawing/2010/main" val="0"/>
+                        </a:ext>
+                      </a:extLst>
+                    </a:blip>
+                    <a:stretch>
+                      <a:fillRect/>
+                    </a:stretch>
+                  </pic:blipFill>
+                  <pic:spPr>
+                    <a:xfrm>
+                      <a:off x="0" y="0"/>
+                      <a:ext cx="5431790" cy="4972050"/>
+                    </a:xfrm>
+                    <a:prstGeom prst="rect">
+                      <a:avLst/>
+                    </a:prstGeom>
+                  </pic:spPr>
+                </pic:pic>
+              </a:graphicData>
+            </a:graphic>
+          </wp:inline>
+        </w:drawing>
+      </w:r>
+    </w:p>
+    <w:p>
+      <w:pPr>
+        <w:pStyle w:val="Ttulo2"/>
+      </w:pPr>
+      <w:r>
+        <w:lastRenderedPageBreak/>
+        <w:t xml:space="preserve">Caso de uso </w:t>
+      </w:r>
+      <w:r>
+        <w:t>Cadastrar Catador</w:t>
       </w:r>
     </w:p>
     <w:p/>
     <w:p>
+      <w:r>
+        <w:rPr>
+          <w:noProof/>
+        </w:rPr>
+        <w:drawing>
+          <wp:inline distT="0" distB="0" distL="0" distR="0" wp14:anchorId="0820845C" wp14:editId="45A6DB67">
+            <wp:extent cx="3520440" cy="4543425"/>
+            <wp:effectExtent l="0" t="0" r="3810" b="9525"/>
+            <wp:docPr id="1" name="Imagem 1"/>
+            <wp:cNvGraphicFramePr>
+              <a:graphicFrameLocks xmlns:a="http://schemas.openxmlformats.org/drawingml/2006/main" noChangeAspect="1"/>
+            </wp:cNvGraphicFramePr>
+            <a:graphic xmlns:a="http://schemas.openxmlformats.org/drawingml/2006/main">
+              <a:graphicData uri="http://schemas.openxmlformats.org/drawingml/2006/picture">
+                <pic:pic xmlns:pic="http://schemas.openxmlformats.org/drawingml/2006/picture">
+                  <pic:nvPicPr>
+                    <pic:cNvPr id="1" name="Imagem 1"/>
+                    <pic:cNvPicPr/>
+                  </pic:nvPicPr>
+                  <pic:blipFill>
+                    <a:blip r:embed="rId10">
+                      <a:extLst>
+                        <a:ext uri="{28A0092B-C50C-407E-A947-70E740481C1C}">
+                          <a14:useLocalDpi xmlns:a14="http://schemas.microsoft.com/office/drawing/2010/main" val="0"/>
+                        </a:ext>
+                      </a:extLst>
+                    </a:blip>
+                    <a:stretch>
+                      <a:fillRect/>
+                    </a:stretch>
+                  </pic:blipFill>
+                  <pic:spPr>
+                    <a:xfrm>
+                      <a:off x="0" y="0"/>
+                      <a:ext cx="3520440" cy="4543425"/>
+                    </a:xfrm>
+                    <a:prstGeom prst="rect">
+                      <a:avLst/>
+                    </a:prstGeom>
+                  </pic:spPr>
+                </pic:pic>
+              </a:graphicData>
+            </a:graphic>
+          </wp:inline>
+        </w:drawing>
+      </w:r>
+    </w:p>
+    <w:p>
       <w:pPr>
         <w:pStyle w:val="Ttulo2"/>
       </w:pPr>
       <w:r>
-        <w:t>Caso de uso &lt;NOME&gt;</w:t>
+        <w:t xml:space="preserve">Caso de uso </w:t>
+      </w:r>
+      <w:r>
+        <w:t>cadastrar ponto de coleta</w:t>
       </w:r>
     </w:p>
     <w:p/>
     <w:p>
-      <w:pPr>
-        <w:pStyle w:val="Ttulo2"/>
-      </w:pPr>
       <w:r>
-        <w:t>Caso de uso &lt;NOME&gt;</w:t>
+        <w:rPr>
+          <w:noProof/>
+        </w:rPr>
+        <w:lastRenderedPageBreak/>
+        <w:drawing>
+          <wp:inline distT="0" distB="0" distL="0" distR="0" wp14:anchorId="5EC565F5" wp14:editId="5D42BF3A">
+            <wp:extent cx="4672330" cy="5143500"/>
+            <wp:effectExtent l="0" t="0" r="0" b="0"/>
+            <wp:docPr id="2" name="Imagem 2"/>
+            <wp:cNvGraphicFramePr>
+              <a:graphicFrameLocks xmlns:a="http://schemas.openxmlformats.org/drawingml/2006/main" noChangeAspect="1"/>
+            </wp:cNvGraphicFramePr>
+            <a:graphic xmlns:a="http://schemas.openxmlformats.org/drawingml/2006/main">
+              <a:graphicData uri="http://schemas.openxmlformats.org/drawingml/2006/picture">
+                <pic:pic xmlns:pic="http://schemas.openxmlformats.org/drawingml/2006/picture">
+                  <pic:nvPicPr>
+                    <pic:cNvPr id="2" name="Imagem 2"/>
+                    <pic:cNvPicPr/>
+                  </pic:nvPicPr>
+                  <pic:blipFill>
+                    <a:blip r:embed="rId11">
+                      <a:extLst>
+                        <a:ext uri="{28A0092B-C50C-407E-A947-70E740481C1C}">
+                          <a14:useLocalDpi xmlns:a14="http://schemas.microsoft.com/office/drawing/2010/main" val="0"/>
+                        </a:ext>
+                      </a:extLst>
+                    </a:blip>
+                    <a:stretch>
+                      <a:fillRect/>
+                    </a:stretch>
+                  </pic:blipFill>
+                  <pic:spPr>
+                    <a:xfrm>
+                      <a:off x="0" y="0"/>
+                      <a:ext cx="4672330" cy="5143500"/>
+                    </a:xfrm>
+                    <a:prstGeom prst="rect">
+                      <a:avLst/>
+                    </a:prstGeom>
+                  </pic:spPr>
+                </pic:pic>
+              </a:graphicData>
+            </a:graphic>
+          </wp:inline>
+        </w:drawing>
       </w:r>
     </w:p>
     <w:p>
-      <w:bookmarkStart w:id="0" w:name="_GoBack"/>
-      <w:bookmarkEnd w:id="0"/>
-    </w:p>
-    <w:p>
       <w:pPr>
         <w:pStyle w:val="Ttulo1"/>
       </w:pPr>
       <w:r>
+        <w:lastRenderedPageBreak/>
         <w:t>A</w:t>
       </w:r>
       <w:r>
@@ -257,7 +410,7 @@
     </w:tbl>
     <w:p/>
     <w:sectPr>
-      <w:headerReference w:type="default" r:id="rId9"/>
+      <w:headerReference w:type="default" r:id="rId12"/>
       <w:pgSz w:w="16839" w:h="11907" w:orient="landscape" w:code="9"/>
       <w:pgMar w:top="1440" w:right="1440" w:bottom="1440" w:left="1440" w:header="720" w:footer="864" w:gutter="0"/>
       <w:cols w:space="720"/>
@@ -268,7 +421,7 @@
 </file>
 
 <file path=word/endnotes.xml><?xml version="1.0" encoding="utf-8"?>
-<w:endnotes xmlns:wpc="http://schemas.microsoft.com/office/word/2010/wordprocessingCanvas" xmlns:mc="http://schemas.openxmlformats.org/markup-compatibility/2006" xmlns:o="urn:schemas-microsoft-com:office:office" xmlns:r="http://schemas.openxmlformats.org/officeDocument/2006/relationships" xmlns:m="http://schemas.openxmlformats.org/officeDocument/2006/math" xmlns:v="urn:schemas-microsoft-com:vml" xmlns:wp14="http://schemas.microsoft.com/office/word/2010/wordprocessingDrawing" xmlns:wp="http://schemas.openxmlformats.org/drawingml/2006/wordprocessingDrawing" xmlns:w10="urn:schemas-microsoft-com:office:word" xmlns:w="http://schemas.openxmlformats.org/wordprocessingml/2006/main" xmlns:w14="http://schemas.microsoft.com/office/word/2010/wordml" xmlns:w15="http://schemas.microsoft.com/office/word/2012/wordml" xmlns:wpg="http://schemas.microsoft.com/office/word/2010/wordprocessingGroup" xmlns:wpi="http://schemas.microsoft.com/office/word/2010/wordprocessingInk" xmlns:wne="http://schemas.microsoft.com/office/word/2006/wordml" xmlns:wps="http://schemas.microsoft.com/office/word/2010/wordprocessingShape" mc:Ignorable="w14 w15 wp14">
+<w:endnotes xmlns:wpc="http://schemas.microsoft.com/office/word/2010/wordprocessingCanvas" xmlns:cx="http://schemas.microsoft.com/office/drawing/2014/chartex" xmlns:cx1="http://schemas.microsoft.com/office/drawing/2015/9/8/chartex" xmlns:cx2="http://schemas.microsoft.com/office/drawing/2015/10/21/chartex" xmlns:cx3="http://schemas.microsoft.com/office/drawing/2016/5/9/chartex" xmlns:cx4="http://schemas.microsoft.com/office/drawing/2016/5/10/chartex" xmlns:cx5="http://schemas.microsoft.com/office/drawing/2016/5/11/chartex" xmlns:cx6="http://schemas.microsoft.com/office/drawing/2016/5/12/chartex" xmlns:cx7="http://schemas.microsoft.com/office/drawing/2016/5/13/chartex" xmlns:cx8="http://schemas.microsoft.com/office/drawing/2016/5/14/chartex" xmlns:mc="http://schemas.openxmlformats.org/markup-compatibility/2006" xmlns:aink="http://schemas.microsoft.com/office/drawing/2016/ink" xmlns:am3d="http://schemas.microsoft.com/office/drawing/2017/model3d" xmlns:o="urn:schemas-microsoft-com:office:office" xmlns:r="http://schemas.openxmlformats.org/officeDocument/2006/relationships" xmlns:m="http://schemas.openxmlformats.org/officeDocument/2006/math" xmlns:v="urn:schemas-microsoft-com:vml" xmlns:wp14="http://schemas.microsoft.com/office/word/2010/wordprocessingDrawing" xmlns:wp="http://schemas.openxmlformats.org/drawingml/2006/wordprocessingDrawing" xmlns:w10="urn:schemas-microsoft-com:office:word" xmlns:w="http://schemas.openxmlformats.org/wordprocessingml/2006/main" xmlns:w14="http://schemas.microsoft.com/office/word/2010/wordml" xmlns:w15="http://schemas.microsoft.com/office/word/2012/wordml" xmlns:w16cex="http://schemas.microsoft.com/office/word/2018/wordml/cex" xmlns:w16cid="http://schemas.microsoft.com/office/word/2016/wordml/cid" xmlns:w16="http://schemas.microsoft.com/office/word/2018/wordml" xmlns:w16sdtdh="http://schemas.microsoft.com/office/word/2020/wordml/sdtdatahash" xmlns:w16se="http://schemas.microsoft.com/office/word/2015/wordml/symex" xmlns:wpg="http://schemas.microsoft.com/office/word/2010/wordprocessingGroup" xmlns:wpi="http://schemas.microsoft.com/office/word/2010/wordprocessingInk" xmlns:wne="http://schemas.microsoft.com/office/word/2006/wordml" xmlns:wps="http://schemas.microsoft.com/office/word/2010/wordprocessingShape" mc:Ignorable="w14 w15 w16se w16cid w16 w16cex w16sdtdh wp14">
   <w:endnote w:type="separator" w:id="-1">
     <w:p>
       <w:pPr>
@@ -293,7 +446,7 @@
 </file>
 
 <file path=word/footnotes.xml><?xml version="1.0" encoding="utf-8"?>
-<w:footnotes xmlns:wpc="http://schemas.microsoft.com/office/word/2010/wordprocessingCanvas" xmlns:mc="http://schemas.openxmlformats.org/markup-compatibility/2006" xmlns:o="urn:schemas-microsoft-com:office:office" xmlns:r="http://schemas.openxmlformats.org/officeDocument/2006/relationships" xmlns:m="http://schemas.openxmlformats.org/officeDocument/2006/math" xmlns:v="urn:schemas-microsoft-com:vml" xmlns:wp14="http://schemas.microsoft.com/office/word/2010/wordprocessingDrawing" xmlns:wp="http://schemas.openxmlformats.org/drawingml/2006/wordprocessingDrawing" xmlns:w10="urn:schemas-microsoft-com:office:word" xmlns:w="http://schemas.openxmlformats.org/wordprocessingml/2006/main" xmlns:w14="http://schemas.microsoft.com/office/word/2010/wordml" xmlns:w15="http://schemas.microsoft.com/office/word/2012/wordml" xmlns:wpg="http://schemas.microsoft.com/office/word/2010/wordprocessingGroup" xmlns:wpi="http://schemas.microsoft.com/office/word/2010/wordprocessingInk" xmlns:wne="http://schemas.microsoft.com/office/word/2006/wordml" xmlns:wps="http://schemas.microsoft.com/office/word/2010/wordprocessingShape" mc:Ignorable="w14 w15 wp14">
+<w:footnotes xmlns:wpc="http://schemas.microsoft.com/office/word/2010/wordprocessingCanvas" xmlns:cx="http://schemas.microsoft.com/office/drawing/2014/chartex" xmlns:cx1="http://schemas.microsoft.com/office/drawing/2015/9/8/chartex" xmlns:cx2="http://schemas.microsoft.com/office/drawing/2015/10/21/chartex" xmlns:cx3="http://schemas.microsoft.com/office/drawing/2016/5/9/chartex" xmlns:cx4="http://schemas.microsoft.com/office/drawing/2016/5/10/chartex" xmlns:cx5="http://schemas.microsoft.com/office/drawing/2016/5/11/chartex" xmlns:cx6="http://schemas.microsoft.com/office/drawing/2016/5/12/chartex" xmlns:cx7="http://schemas.microsoft.com/office/drawing/2016/5/13/chartex" xmlns:cx8="http://schemas.microsoft.com/office/drawing/2016/5/14/chartex" xmlns:mc="http://schemas.openxmlformats.org/markup-compatibility/2006" xmlns:aink="http://schemas.microsoft.com/office/drawing/2016/ink" xmlns:am3d="http://schemas.microsoft.com/office/drawing/2017/model3d" xmlns:o="urn:schemas-microsoft-com:office:office" xmlns:r="http://schemas.openxmlformats.org/officeDocument/2006/relationships" xmlns:m="http://schemas.openxmlformats.org/officeDocument/2006/math" xmlns:v="urn:schemas-microsoft-com:vml" xmlns:wp14="http://schemas.microsoft.com/office/word/2010/wordprocessingDrawing" xmlns:wp="http://schemas.openxmlformats.org/drawingml/2006/wordprocessingDrawing" xmlns:w10="urn:schemas-microsoft-com:office:word" xmlns:w="http://schemas.openxmlformats.org/wordprocessingml/2006/main" xmlns:w14="http://schemas.microsoft.com/office/word/2010/wordml" xmlns:w15="http://schemas.microsoft.com/office/word/2012/wordml" xmlns:w16cex="http://schemas.microsoft.com/office/word/2018/wordml/cex" xmlns:w16cid="http://schemas.microsoft.com/office/word/2016/wordml/cid" xmlns:w16="http://schemas.microsoft.com/office/word/2018/wordml" xmlns:w16sdtdh="http://schemas.microsoft.com/office/word/2020/wordml/sdtdatahash" xmlns:w16se="http://schemas.microsoft.com/office/word/2015/wordml/symex" xmlns:wpg="http://schemas.microsoft.com/office/word/2010/wordprocessingGroup" xmlns:wpi="http://schemas.microsoft.com/office/word/2010/wordprocessingInk" xmlns:wne="http://schemas.microsoft.com/office/word/2006/wordml" xmlns:wps="http://schemas.microsoft.com/office/word/2010/wordprocessingShape" mc:Ignorable="w14 w15 w16se w16cid w16 w16cex w16sdtdh wp14">
   <w:footnote w:type="separator" w:id="-1">
     <w:p>
       <w:pPr>
@@ -318,7 +471,7 @@
 </file>
 
 <file path=word/header1.xml><?xml version="1.0" encoding="utf-8"?>
-<w:hdr xmlns:wpc="http://schemas.microsoft.com/office/word/2010/wordprocessingCanvas" xmlns:mc="http://schemas.openxmlformats.org/markup-compatibility/2006" xmlns:o="urn:schemas-microsoft-com:office:office" xmlns:r="http://schemas.openxmlformats.org/officeDocument/2006/relationships" xmlns:m="http://schemas.openxmlformats.org/officeDocument/2006/math" xmlns:v="urn:schemas-microsoft-com:vml" xmlns:wp14="http://schemas.microsoft.com/office/word/2010/wordprocessingDrawing" xmlns:wp="http://schemas.openxmlformats.org/drawingml/2006/wordprocessingDrawing" xmlns:w10="urn:schemas-microsoft-com:office:word" xmlns:w="http://schemas.openxmlformats.org/wordprocessingml/2006/main" xmlns:w14="http://schemas.microsoft.com/office/word/2010/wordml" xmlns:w15="http://schemas.microsoft.com/office/word/2012/wordml" xmlns:wpg="http://schemas.microsoft.com/office/word/2010/wordprocessingGroup" xmlns:wpi="http://schemas.microsoft.com/office/word/2010/wordprocessingInk" xmlns:wne="http://schemas.microsoft.com/office/word/2006/wordml" xmlns:wps="http://schemas.microsoft.com/office/word/2010/wordprocessingShape" mc:Ignorable="w14 w15 wp14">
+<w:hdr xmlns:wpc="http://schemas.microsoft.com/office/word/2010/wordprocessingCanvas" xmlns:cx="http://schemas.microsoft.com/office/drawing/2014/chartex" xmlns:cx1="http://schemas.microsoft.com/office/drawing/2015/9/8/chartex" xmlns:cx2="http://schemas.microsoft.com/office/drawing/2015/10/21/chartex" xmlns:cx3="http://schemas.microsoft.com/office/drawing/2016/5/9/chartex" xmlns:cx4="http://schemas.microsoft.com/office/drawing/2016/5/10/chartex" xmlns:cx5="http://schemas.microsoft.com/office/drawing/2016/5/11/chartex" xmlns:cx6="http://schemas.microsoft.com/office/drawing/2016/5/12/chartex" xmlns:cx7="http://schemas.microsoft.com/office/drawing/2016/5/13/chartex" xmlns:cx8="http://schemas.microsoft.com/office/drawing/2016/5/14/chartex" xmlns:mc="http://schemas.openxmlformats.org/markup-compatibility/2006" xmlns:aink="http://schemas.microsoft.com/office/drawing/2016/ink" xmlns:am3d="http://schemas.microsoft.com/office/drawing/2017/model3d" xmlns:o="urn:schemas-microsoft-com:office:office" xmlns:r="http://schemas.openxmlformats.org/officeDocument/2006/relationships" xmlns:m="http://schemas.openxmlformats.org/officeDocument/2006/math" xmlns:v="urn:schemas-microsoft-com:vml" xmlns:wp14="http://schemas.microsoft.com/office/word/2010/wordprocessingDrawing" xmlns:wp="http://schemas.openxmlformats.org/drawingml/2006/wordprocessingDrawing" xmlns:w10="urn:schemas-microsoft-com:office:word" xmlns:w="http://schemas.openxmlformats.org/wordprocessingml/2006/main" xmlns:w14="http://schemas.microsoft.com/office/word/2010/wordml" xmlns:w15="http://schemas.microsoft.com/office/word/2012/wordml" xmlns:w16cex="http://schemas.microsoft.com/office/word/2018/wordml/cex" xmlns:w16cid="http://schemas.microsoft.com/office/word/2016/wordml/cid" xmlns:w16="http://schemas.microsoft.com/office/word/2018/wordml" xmlns:w16sdtdh="http://schemas.microsoft.com/office/word/2020/wordml/sdtdatahash" xmlns:w16se="http://schemas.microsoft.com/office/word/2015/wordml/symex" xmlns:wpg="http://schemas.microsoft.com/office/word/2010/wordprocessingGroup" xmlns:wpi="http://schemas.microsoft.com/office/word/2010/wordprocessingInk" xmlns:wne="http://schemas.microsoft.com/office/word/2006/wordml" xmlns:wps="http://schemas.microsoft.com/office/word/2010/wordprocessingShape" mc:Ignorable="w14 w15 w16se w16cid w16 w16cex w16sdtdh wp14">
   <w:p>
     <w:pPr>
       <w:pStyle w:val="Cabealho"/>
@@ -330,7 +483,7 @@
       <mc:AlternateContent>
         <mc:Choice Requires="wps">
           <w:drawing>
-            <wp:anchor distT="0" distB="0" distL="114300" distR="114300" simplePos="0" relativeHeight="251659264" behindDoc="0" locked="0" layoutInCell="1" allowOverlap="1">
+            <wp:anchor distT="0" distB="0" distL="114300" distR="114300" simplePos="0" relativeHeight="251659264" behindDoc="0" locked="0" layoutInCell="1" allowOverlap="1" wp14:anchorId="37AD0A88" wp14:editId="0479C9FE">
               <wp:simplePos x="0" y="0"/>
               <wp:positionH relativeFrom="leftMargin">
                 <wp:align>right</wp:align>
@@ -459,8 +612,8 @@
 </file>
 
 <file path=word/numbering.xml><?xml version="1.0" encoding="utf-8"?>
-<w:numbering xmlns:wpc="http://schemas.microsoft.com/office/word/2010/wordprocessingCanvas" xmlns:mc="http://schemas.openxmlformats.org/markup-compatibility/2006" xmlns:o="urn:schemas-microsoft-com:office:office" xmlns:r="http://schemas.openxmlformats.org/officeDocument/2006/relationships" xmlns:m="http://schemas.openxmlformats.org/officeDocument/2006/math" xmlns:v="urn:schemas-microsoft-com:vml" xmlns:wp14="http://schemas.microsoft.com/office/word/2010/wordprocessingDrawing" xmlns:wp="http://schemas.openxmlformats.org/drawingml/2006/wordprocessingDrawing" xmlns:w10="urn:schemas-microsoft-com:office:word" xmlns:w="http://schemas.openxmlformats.org/wordprocessingml/2006/main" xmlns:w14="http://schemas.microsoft.com/office/word/2010/wordml" xmlns:w15="http://schemas.microsoft.com/office/word/2012/wordml" xmlns:wpg="http://schemas.microsoft.com/office/word/2010/wordprocessingGroup" xmlns:wpi="http://schemas.microsoft.com/office/word/2010/wordprocessingInk" xmlns:wne="http://schemas.microsoft.com/office/word/2006/wordml" xmlns:wps="http://schemas.microsoft.com/office/word/2010/wordprocessingShape" mc:Ignorable="w14 w15 wp14">
-  <w:abstractNum w:abstractNumId="0">
+<w:numbering xmlns:wpc="http://schemas.microsoft.com/office/word/2010/wordprocessingCanvas" xmlns:cx="http://schemas.microsoft.com/office/drawing/2014/chartex" xmlns:cx1="http://schemas.microsoft.com/office/drawing/2015/9/8/chartex" xmlns:cx2="http://schemas.microsoft.com/office/drawing/2015/10/21/chartex" xmlns:cx3="http://schemas.microsoft.com/office/drawing/2016/5/9/chartex" xmlns:cx4="http://schemas.microsoft.com/office/drawing/2016/5/10/chartex" xmlns:cx5="http://schemas.microsoft.com/office/drawing/2016/5/11/chartex" xmlns:cx6="http://schemas.microsoft.com/office/drawing/2016/5/12/chartex" xmlns:cx7="http://schemas.microsoft.com/office/drawing/2016/5/13/chartex" xmlns:cx8="http://schemas.microsoft.com/office/drawing/2016/5/14/chartex" xmlns:mc="http://schemas.openxmlformats.org/markup-compatibility/2006" xmlns:aink="http://schemas.microsoft.com/office/drawing/2016/ink" xmlns:am3d="http://schemas.microsoft.com/office/drawing/2017/model3d" xmlns:o="urn:schemas-microsoft-com:office:office" xmlns:r="http://schemas.openxmlformats.org/officeDocument/2006/relationships" xmlns:m="http://schemas.openxmlformats.org/officeDocument/2006/math" xmlns:v="urn:schemas-microsoft-com:vml" xmlns:wp14="http://schemas.microsoft.com/office/word/2010/wordprocessingDrawing" xmlns:wp="http://schemas.openxmlformats.org/drawingml/2006/wordprocessingDrawing" xmlns:w10="urn:schemas-microsoft-com:office:word" xmlns:w="http://schemas.openxmlformats.org/wordprocessingml/2006/main" xmlns:w14="http://schemas.microsoft.com/office/word/2010/wordml" xmlns:w15="http://schemas.microsoft.com/office/word/2012/wordml" xmlns:w16cex="http://schemas.microsoft.com/office/word/2018/wordml/cex" xmlns:w16cid="http://schemas.microsoft.com/office/word/2016/wordml/cid" xmlns:w16="http://schemas.microsoft.com/office/word/2018/wordml" xmlns:w16sdtdh="http://schemas.microsoft.com/office/word/2020/wordml/sdtdatahash" xmlns:w16se="http://schemas.microsoft.com/office/word/2015/wordml/symex" xmlns:wpg="http://schemas.microsoft.com/office/word/2010/wordprocessingGroup" xmlns:wpi="http://schemas.microsoft.com/office/word/2010/wordprocessingInk" xmlns:wne="http://schemas.microsoft.com/office/word/2006/wordml" xmlns:wps="http://schemas.microsoft.com/office/word/2010/wordprocessingShape" mc:Ignorable="w14 w15 w16se w16cid w16 w16cex w16sdtdh wp14">
+  <w:abstractNum w:abstractNumId="0" w15:restartNumberingAfterBreak="0">
     <w:nsid w:val="FFFFFF89"/>
     <w:multiLevelType w:val="singleLevel"/>
     <w:tmpl w:val="7E04C5A8"/>
@@ -480,7 +633,7 @@
       </w:rPr>
     </w:lvl>
   </w:abstractNum>
-  <w:abstractNum w:abstractNumId="1">
+  <w:abstractNum w:abstractNumId="1" w15:restartNumberingAfterBreak="0">
     <w:nsid w:val="05BD582D"/>
     <w:multiLevelType w:val="multilevel"/>
     <w:tmpl w:val="A7AE6E6A"/>
@@ -605,7 +758,7 @@
       </w:rPr>
     </w:lvl>
   </w:abstractNum>
-  <w:abstractNum w:abstractNumId="2">
+  <w:abstractNum w:abstractNumId="2" w15:restartNumberingAfterBreak="0">
     <w:nsid w:val="0F5F6A06"/>
     <w:multiLevelType w:val="multilevel"/>
     <w:tmpl w:val="89A2A184"/>
@@ -754,7 +907,7 @@
       </w:rPr>
     </w:lvl>
   </w:abstractNum>
-  <w:abstractNum w:abstractNumId="3">
+  <w:abstractNum w:abstractNumId="3" w15:restartNumberingAfterBreak="0">
     <w:nsid w:val="657E5D71"/>
     <w:multiLevelType w:val="hybridMultilevel"/>
     <w:tmpl w:val="BFBE56B6"/>
@@ -894,7 +1047,7 @@
 </file>
 
 <file path=word/styles.xml><?xml version="1.0" encoding="utf-8"?>
-<w:styles xmlns:mc="http://schemas.openxmlformats.org/markup-compatibility/2006" xmlns:r="http://schemas.openxmlformats.org/officeDocument/2006/relationships" xmlns:w="http://schemas.openxmlformats.org/wordprocessingml/2006/main" xmlns:w14="http://schemas.microsoft.com/office/word/2010/wordml" xmlns:w15="http://schemas.microsoft.com/office/word/2012/wordml" mc:Ignorable="w14 w15">
+<w:styles xmlns:mc="http://schemas.openxmlformats.org/markup-compatibility/2006" xmlns:r="http://schemas.openxmlformats.org/officeDocument/2006/relationships" xmlns:w="http://schemas.openxmlformats.org/wordprocessingml/2006/main" xmlns:w14="http://schemas.microsoft.com/office/word/2010/wordml" xmlns:w15="http://schemas.microsoft.com/office/word/2012/wordml" xmlns:w16cex="http://schemas.microsoft.com/office/word/2018/wordml/cex" xmlns:w16cid="http://schemas.microsoft.com/office/word/2016/wordml/cid" xmlns:w16="http://schemas.microsoft.com/office/word/2018/wordml" xmlns:w16sdtdh="http://schemas.microsoft.com/office/word/2020/wordml/sdtdatahash" xmlns:w16se="http://schemas.microsoft.com/office/word/2015/wordml/symex" mc:Ignorable="w14 w15 w16se w16cid w16 w16cex w16sdtdh">
   <w:docDefaults>
     <w:rPrDefault>
       <w:rPr>
@@ -910,7 +1063,7 @@
       </w:pPr>
     </w:pPrDefault>
   </w:docDefaults>
-  <w:latentStyles w:defLockedState="0" w:defUIPriority="99" w:defSemiHidden="0" w:defUnhideWhenUsed="0" w:defQFormat="0" w:count="371">
+  <w:latentStyles w:defLockedState="0" w:defUIPriority="99" w:defSemiHidden="0" w:defUnhideWhenUsed="0" w:defQFormat="0" w:count="376">
     <w:lsdException w:name="Normal" w:uiPriority="0" w:qFormat="1"/>
     <w:lsdException w:name="heading 1" w:uiPriority="9" w:qFormat="1"/>
     <w:lsdException w:name="heading 2" w:semiHidden="1" w:uiPriority="9" w:unhideWhenUsed="1" w:qFormat="1"/>
@@ -1016,7 +1169,6 @@
     <w:lsdException w:name="HTML Sample" w:semiHidden="1" w:unhideWhenUsed="1"/>
     <w:lsdException w:name="HTML Typewriter" w:semiHidden="1" w:unhideWhenUsed="1"/>
     <w:lsdException w:name="HTML Variable" w:semiHidden="1" w:unhideWhenUsed="1"/>
-    <w:lsdException w:name="Normal Table" w:semiHidden="1" w:unhideWhenUsed="1"/>
     <w:lsdException w:name="annotation subject" w:semiHidden="1" w:unhideWhenUsed="1"/>
     <w:lsdException w:name="No List" w:semiHidden="1" w:unhideWhenUsed="1"/>
     <w:lsdException w:name="Outline List 1" w:semiHidden="1" w:unhideWhenUsed="1"/>
@@ -1059,11 +1211,8 @@
     <w:lsdException w:name="Table Contemporary" w:semiHidden="1" w:unhideWhenUsed="1"/>
     <w:lsdException w:name="Table Elegant" w:semiHidden="1" w:unhideWhenUsed="1"/>
     <w:lsdException w:name="Table Professional" w:semiHidden="1" w:unhideWhenUsed="1"/>
-    <w:lsdException w:name="Table Subtle 1" w:semiHidden="1" w:unhideWhenUsed="1"/>
     <w:lsdException w:name="Table Subtle 2" w:semiHidden="1" w:unhideWhenUsed="1"/>
     <w:lsdException w:name="Table Web 1" w:semiHidden="1" w:unhideWhenUsed="1"/>
-    <w:lsdException w:name="Table Web 2" w:semiHidden="1" w:unhideWhenUsed="1"/>
-    <w:lsdException w:name="Table Web 3" w:semiHidden="1" w:unhideWhenUsed="1"/>
     <w:lsdException w:name="Balloon Text" w:semiHidden="1" w:unhideWhenUsed="1"/>
     <w:lsdException w:name="Table Grid" w:uiPriority="39"/>
     <w:lsdException w:name="Table Theme" w:semiHidden="1" w:unhideWhenUsed="1"/>
@@ -1282,6 +1431,11 @@
     <w:lsdException w:name="List Table 5 Dark Accent 6" w:uiPriority="50"/>
     <w:lsdException w:name="List Table 6 Colorful Accent 6" w:uiPriority="51"/>
     <w:lsdException w:name="List Table 7 Colorful Accent 6" w:uiPriority="52"/>
+    <w:lsdException w:name="Mention" w:semiHidden="1" w:unhideWhenUsed="1"/>
+    <w:lsdException w:name="Smart Hyperlink" w:semiHidden="1" w:unhideWhenUsed="1"/>
+    <w:lsdException w:name="Hashtag" w:semiHidden="1" w:unhideWhenUsed="1"/>
+    <w:lsdException w:name="Unresolved Mention" w:semiHidden="1" w:unhideWhenUsed="1"/>
+    <w:lsdException w:name="Smart Link" w:semiHidden="1" w:unhideWhenUsed="1"/>
   </w:latentStyles>
   <w:style w:type="paragraph" w:default="1" w:styleId="Normal">
     <w:name w:val="Normal"/>
@@ -1423,7 +1577,6 @@
       <w:spacing w:after="0" w:line="240" w:lineRule="auto"/>
     </w:pPr>
     <w:tblPr>
-      <w:tblInd w:w="0" w:type="dxa"/>
       <w:tblBorders>
         <w:top w:val="single" w:sz="4" w:space="0" w:color="auto"/>
         <w:left w:val="single" w:sz="4" w:space="0" w:color="auto"/>
@@ -1432,12 +1585,6 @@
         <w:insideH w:val="single" w:sz="4" w:space="0" w:color="auto"/>
         <w:insideV w:val="single" w:sz="4" w:space="0" w:color="auto"/>
       </w:tblBorders>
-      <w:tblCellMar>
-        <w:top w:w="0" w:type="dxa"/>
-        <w:left w:w="108" w:type="dxa"/>
-        <w:bottom w:w="0" w:type="dxa"/>
-        <w:right w:w="108" w:type="dxa"/>
-      </w:tblCellMar>
     </w:tblPr>
   </w:style>
   <w:style w:type="paragraph" w:styleId="Subttulo">
@@ -1496,11 +1643,9 @@
       <w:spacing w:after="0" w:line="240" w:lineRule="auto"/>
     </w:pPr>
     <w:tblPr>
-      <w:tblInd w:w="0" w:type="dxa"/>
       <w:tblCellMar>
         <w:top w:w="144" w:type="dxa"/>
         <w:left w:w="0" w:type="dxa"/>
-        <w:bottom w:w="0" w:type="dxa"/>
         <w:right w:w="0" w:type="dxa"/>
       </w:tblCellMar>
     </w:tblPr>
@@ -1631,7 +1776,6 @@
     <w:tblPr>
       <w:tblStyleRowBandSize w:val="1"/>
       <w:tblStyleColBandSize w:val="1"/>
-      <w:tblInd w:w="0" w:type="dxa"/>
       <w:tblBorders>
         <w:top w:val="single" w:sz="4" w:space="0" w:color="9CC2E5" w:themeColor="accent1" w:themeTint="99"/>
         <w:left w:val="single" w:sz="4" w:space="0" w:color="9CC2E5" w:themeColor="accent1" w:themeTint="99"/>
@@ -1642,9 +1786,7 @@
       </w:tblBorders>
       <w:tblCellMar>
         <w:top w:w="29" w:type="dxa"/>
-        <w:left w:w="108" w:type="dxa"/>
         <w:bottom w:w="29" w:type="dxa"/>
-        <w:right w:w="108" w:type="dxa"/>
       </w:tblCellMar>
     </w:tblPr>
     <w:tblStylePr w:type="firstRow">
@@ -1711,7 +1853,6 @@
       <w:spacing w:after="0" w:line="240" w:lineRule="auto"/>
     </w:pPr>
     <w:tblPr>
-      <w:tblInd w:w="0" w:type="dxa"/>
       <w:tblBorders>
         <w:top w:val="single" w:sz="4" w:space="0" w:color="BFBFBF" w:themeColor="background1" w:themeShade="BF"/>
         <w:left w:val="single" w:sz="4" w:space="0" w:color="BFBFBF" w:themeColor="background1" w:themeShade="BF"/>
@@ -1720,12 +1861,6 @@
         <w:insideH w:val="single" w:sz="4" w:space="0" w:color="BFBFBF" w:themeColor="background1" w:themeShade="BF"/>
         <w:insideV w:val="single" w:sz="4" w:space="0" w:color="BFBFBF" w:themeColor="background1" w:themeShade="BF"/>
       </w:tblBorders>
-      <w:tblCellMar>
-        <w:top w:w="0" w:type="dxa"/>
-        <w:left w:w="108" w:type="dxa"/>
-        <w:bottom w:w="0" w:type="dxa"/>
-        <w:right w:w="108" w:type="dxa"/>
-      </w:tblCellMar>
     </w:tblPr>
   </w:style>
   <w:style w:type="table" w:customStyle="1" w:styleId="ProjectScopeTable">
@@ -1736,7 +1871,6 @@
       <w:spacing w:before="120" w:after="120" w:line="240" w:lineRule="auto"/>
     </w:pPr>
     <w:tblPr>
-      <w:tblInd w:w="0" w:type="dxa"/>
       <w:tblBorders>
         <w:top w:val="single" w:sz="4" w:space="0" w:color="5B9BD5" w:themeColor="accent1"/>
         <w:left w:val="single" w:sz="4" w:space="0" w:color="5B9BD5" w:themeColor="accent1"/>
@@ -1746,9 +1880,7 @@
         <w:insideV w:val="single" w:sz="4" w:space="0" w:color="5B9BD5" w:themeColor="accent1"/>
       </w:tblBorders>
       <w:tblCellMar>
-        <w:top w:w="0" w:type="dxa"/>
         <w:left w:w="144" w:type="dxa"/>
-        <w:bottom w:w="0" w:type="dxa"/>
         <w:right w:w="144" w:type="dxa"/>
       </w:tblCellMar>
     </w:tblPr>
@@ -1861,7 +1993,7 @@
 </file>
 
 <file path=word/glossary/document.xml><?xml version="1.0" encoding="utf-8"?>
-<w:glossaryDocument xmlns:wpc="http://schemas.microsoft.com/office/word/2010/wordprocessingCanvas" xmlns:mc="http://schemas.openxmlformats.org/markup-compatibility/2006" xmlns:o="urn:schemas-microsoft-com:office:office" xmlns:r="http://schemas.openxmlformats.org/officeDocument/2006/relationships" xmlns:m="http://schemas.openxmlformats.org/officeDocument/2006/math" xmlns:v="urn:schemas-microsoft-com:vml" xmlns:wp14="http://schemas.microsoft.com/office/word/2010/wordprocessingDrawing" xmlns:wp="http://schemas.openxmlformats.org/drawingml/2006/wordprocessingDrawing" xmlns:w10="urn:schemas-microsoft-com:office:word" xmlns:w="http://schemas.openxmlformats.org/wordprocessingml/2006/main" xmlns:w14="http://schemas.microsoft.com/office/word/2010/wordml" xmlns:w15="http://schemas.microsoft.com/office/word/2012/wordml" xmlns:wpg="http://schemas.microsoft.com/office/word/2010/wordprocessingGroup" xmlns:wpi="http://schemas.microsoft.com/office/word/2010/wordprocessingInk" xmlns:wne="http://schemas.microsoft.com/office/word/2006/wordml" xmlns:wps="http://schemas.microsoft.com/office/word/2010/wordprocessingShape" mc:Ignorable="w14 w15 wp14">
+<w:glossaryDocument xmlns:wpc="http://schemas.microsoft.com/office/word/2010/wordprocessingCanvas" xmlns:cx="http://schemas.microsoft.com/office/drawing/2014/chartex" xmlns:cx1="http://schemas.microsoft.com/office/drawing/2015/9/8/chartex" xmlns:cx2="http://schemas.microsoft.com/office/drawing/2015/10/21/chartex" xmlns:cx3="http://schemas.microsoft.com/office/drawing/2016/5/9/chartex" xmlns:cx4="http://schemas.microsoft.com/office/drawing/2016/5/10/chartex" xmlns:cx5="http://schemas.microsoft.com/office/drawing/2016/5/11/chartex" xmlns:cx6="http://schemas.microsoft.com/office/drawing/2016/5/12/chartex" xmlns:cx7="http://schemas.microsoft.com/office/drawing/2016/5/13/chartex" xmlns:cx8="http://schemas.microsoft.com/office/drawing/2016/5/14/chartex" xmlns:mc="http://schemas.openxmlformats.org/markup-compatibility/2006" xmlns:aink="http://schemas.microsoft.com/office/drawing/2016/ink" xmlns:am3d="http://schemas.microsoft.com/office/drawing/2017/model3d" xmlns:o="urn:schemas-microsoft-com:office:office" xmlns:r="http://schemas.openxmlformats.org/officeDocument/2006/relationships" xmlns:m="http://schemas.openxmlformats.org/officeDocument/2006/math" xmlns:v="urn:schemas-microsoft-com:vml" xmlns:wp14="http://schemas.microsoft.com/office/word/2010/wordprocessingDrawing" xmlns:wp="http://schemas.openxmlformats.org/drawingml/2006/wordprocessingDrawing" xmlns:w10="urn:schemas-microsoft-com:office:word" xmlns:w="http://schemas.openxmlformats.org/wordprocessingml/2006/main" xmlns:w14="http://schemas.microsoft.com/office/word/2010/wordml" xmlns:w15="http://schemas.microsoft.com/office/word/2012/wordml" xmlns:w16cex="http://schemas.microsoft.com/office/word/2018/wordml/cex" xmlns:w16cid="http://schemas.microsoft.com/office/word/2016/wordml/cid" xmlns:w16="http://schemas.microsoft.com/office/word/2018/wordml" xmlns:w16sdtdh="http://schemas.microsoft.com/office/word/2020/wordml/sdtdatahash" xmlns:w16se="http://schemas.microsoft.com/office/word/2015/wordml/symex" xmlns:wpg="http://schemas.microsoft.com/office/word/2010/wordprocessingGroup" xmlns:wpi="http://schemas.microsoft.com/office/word/2010/wordprocessingInk" xmlns:wne="http://schemas.microsoft.com/office/word/2006/wordml" xmlns:wps="http://schemas.microsoft.com/office/word/2010/wordprocessingShape" mc:Ignorable="w14 w15 w16se w16cid w16 w16cex w16sdtdh wp14">
   <w:docParts>
     <w:docPart>
       <w:docPartPr>
@@ -1894,7 +2026,7 @@
 </file>
 
 <file path=word/glossary/fontTable.xml><?xml version="1.0" encoding="utf-8"?>
-<w:fonts xmlns:mc="http://schemas.openxmlformats.org/markup-compatibility/2006" xmlns:r="http://schemas.openxmlformats.org/officeDocument/2006/relationships" xmlns:w="http://schemas.openxmlformats.org/wordprocessingml/2006/main" xmlns:w14="http://schemas.microsoft.com/office/word/2010/wordml" xmlns:w15="http://schemas.microsoft.com/office/word/2012/wordml" mc:Ignorable="w14 w15">
+<w:fonts xmlns:mc="http://schemas.openxmlformats.org/markup-compatibility/2006" xmlns:r="http://schemas.openxmlformats.org/officeDocument/2006/relationships" xmlns:w="http://schemas.openxmlformats.org/wordprocessingml/2006/main" xmlns:w14="http://schemas.microsoft.com/office/word/2010/wordml" xmlns:w15="http://schemas.microsoft.com/office/word/2012/wordml" xmlns:w16cex="http://schemas.microsoft.com/office/word/2018/wordml/cex" xmlns:w16cid="http://schemas.microsoft.com/office/word/2016/wordml/cid" xmlns:w16="http://schemas.microsoft.com/office/word/2018/wordml" xmlns:w16sdtdh="http://schemas.microsoft.com/office/word/2020/wordml/sdtdatahash" xmlns:w16se="http://schemas.microsoft.com/office/word/2015/wordml/symex" mc:Ignorable="w14 w15 w16se w16cid w16 w16cex w16sdtdh">
   <w:font w:name="Symbol">
     <w:panose1 w:val="05050102010706020507"/>
     <w:charset w:val="02"/>
@@ -1955,7 +2087,7 @@
 </file>
 
 <file path=word/glossary/settings.xml><?xml version="1.0" encoding="utf-8"?>
-<w:settings xmlns:mc="http://schemas.openxmlformats.org/markup-compatibility/2006" xmlns:o="urn:schemas-microsoft-com:office:office" xmlns:r="http://schemas.openxmlformats.org/officeDocument/2006/relationships" xmlns:m="http://schemas.openxmlformats.org/officeDocument/2006/math" xmlns:v="urn:schemas-microsoft-com:vml" xmlns:w10="urn:schemas-microsoft-com:office:word" xmlns:w="http://schemas.openxmlformats.org/wordprocessingml/2006/main" xmlns:w14="http://schemas.microsoft.com/office/word/2010/wordml" xmlns:w15="http://schemas.microsoft.com/office/word/2012/wordml" xmlns:sl="http://schemas.openxmlformats.org/schemaLibrary/2006/main" mc:Ignorable="w14 w15">
+<w:settings xmlns:mc="http://schemas.openxmlformats.org/markup-compatibility/2006" xmlns:o="urn:schemas-microsoft-com:office:office" xmlns:r="http://schemas.openxmlformats.org/officeDocument/2006/relationships" xmlns:m="http://schemas.openxmlformats.org/officeDocument/2006/math" xmlns:v="urn:schemas-microsoft-com:vml" xmlns:w10="urn:schemas-microsoft-com:office:word" xmlns:w="http://schemas.openxmlformats.org/wordprocessingml/2006/main" xmlns:w14="http://schemas.microsoft.com/office/word/2010/wordml" xmlns:w15="http://schemas.microsoft.com/office/word/2012/wordml" xmlns:w16cex="http://schemas.microsoft.com/office/word/2018/wordml/cex" xmlns:w16cid="http://schemas.microsoft.com/office/word/2016/wordml/cid" xmlns:w16="http://schemas.microsoft.com/office/word/2018/wordml" xmlns:w16sdtdh="http://schemas.microsoft.com/office/word/2020/wordml/sdtdatahash" xmlns:w16se="http://schemas.microsoft.com/office/word/2015/wordml/symex" xmlns:sl="http://schemas.openxmlformats.org/schemaLibrary/2006/main" mc:Ignorable="w14 w15 w16se w16cid w16 w16cex w16sdtdh">
   <w:view w:val="normal"/>
   <w:revisionView w:inkAnnotations="0"/>
   <w:defaultTabStop w:val="708"/>
@@ -1968,6 +2100,7 @@
     <w:compatSetting w:name="enableOpenTypeFeatures" w:uri="http://schemas.microsoft.com/office/word" w:val="1"/>
     <w:compatSetting w:name="doNotFlipMirrorIndents" w:uri="http://schemas.microsoft.com/office/word" w:val="1"/>
     <w:compatSetting w:name="differentiateMultirowTableHeaders" w:uri="http://schemas.microsoft.com/office/word" w:val="1"/>
+    <w:compatSetting w:name="useWord2013TrackBottomHyphenation" w:uri="http://schemas.microsoft.com/office/word" w:val="1"/>
   </w:compat>
   <w:rsids>
     <w:rsidRoot w:val="003C1E1D"/>
@@ -1977,6 +2110,7 @@
     <w:rsid w:val="0028117F"/>
     <w:rsid w:val="003C1E1D"/>
     <w:rsid w:val="00561C3B"/>
+    <w:rsid w:val="00566E57"/>
     <w:rsid w:val="00704804"/>
     <w:rsid w:val="007A3602"/>
     <w:rsid w:val="00851622"/>
@@ -2013,7 +2147,7 @@
 </file>
 
 <file path=word/glossary/styles.xml><?xml version="1.0" encoding="utf-8"?>
-<w:styles xmlns:mc="http://schemas.openxmlformats.org/markup-compatibility/2006" xmlns:r="http://schemas.openxmlformats.org/officeDocument/2006/relationships" xmlns:w="http://schemas.openxmlformats.org/wordprocessingml/2006/main" xmlns:w14="http://schemas.microsoft.com/office/word/2010/wordml" xmlns:w15="http://schemas.microsoft.com/office/word/2012/wordml" mc:Ignorable="w14 w15">
+<w:styles xmlns:mc="http://schemas.openxmlformats.org/markup-compatibility/2006" xmlns:r="http://schemas.openxmlformats.org/officeDocument/2006/relationships" xmlns:w="http://schemas.openxmlformats.org/wordprocessingml/2006/main" xmlns:w14="http://schemas.microsoft.com/office/word/2010/wordml" xmlns:w15="http://schemas.microsoft.com/office/word/2012/wordml" xmlns:w16cex="http://schemas.microsoft.com/office/word/2018/wordml/cex" xmlns:w16cid="http://schemas.microsoft.com/office/word/2016/wordml/cid" xmlns:w16="http://schemas.microsoft.com/office/word/2018/wordml" xmlns:w16sdtdh="http://schemas.microsoft.com/office/word/2020/wordml/sdtdatahash" xmlns:w16se="http://schemas.microsoft.com/office/word/2015/wordml/symex" mc:Ignorable="w14 w15 w16se w16cid w16 w16cex w16sdtdh">
   <w:docDefaults>
     <w:rPrDefault>
       <w:rPr>
@@ -2029,7 +2163,7 @@
       </w:pPr>
     </w:pPrDefault>
   </w:docDefaults>
-  <w:latentStyles w:defLockedState="0" w:defUIPriority="99" w:defSemiHidden="0" w:defUnhideWhenUsed="0" w:defQFormat="0" w:count="371">
+  <w:latentStyles w:defLockedState="0" w:defUIPriority="99" w:defSemiHidden="0" w:defUnhideWhenUsed="0" w:defQFormat="0" w:count="376">
     <w:lsdException w:name="Normal" w:uiPriority="0" w:qFormat="1"/>
     <w:lsdException w:name="heading 1" w:uiPriority="9" w:qFormat="1"/>
     <w:lsdException w:name="heading 2" w:semiHidden="1" w:uiPriority="9" w:unhideWhenUsed="1" w:qFormat="1"/>
@@ -2135,7 +2269,6 @@
     <w:lsdException w:name="HTML Sample" w:semiHidden="1" w:unhideWhenUsed="1"/>
     <w:lsdException w:name="HTML Typewriter" w:semiHidden="1" w:unhideWhenUsed="1"/>
     <w:lsdException w:name="HTML Variable" w:semiHidden="1" w:unhideWhenUsed="1"/>
-    <w:lsdException w:name="Normal Table" w:semiHidden="1" w:unhideWhenUsed="1"/>
     <w:lsdException w:name="annotation subject" w:semiHidden="1" w:unhideWhenUsed="1"/>
     <w:lsdException w:name="No List" w:semiHidden="1" w:unhideWhenUsed="1"/>
     <w:lsdException w:name="Outline List 1" w:semiHidden="1" w:unhideWhenUsed="1"/>
@@ -2178,11 +2311,8 @@
     <w:lsdException w:name="Table Contemporary" w:semiHidden="1" w:unhideWhenUsed="1"/>
     <w:lsdException w:name="Table Elegant" w:semiHidden="1" w:unhideWhenUsed="1"/>
     <w:lsdException w:name="Table Professional" w:semiHidden="1" w:unhideWhenUsed="1"/>
-    <w:lsdException w:name="Table Subtle 1" w:semiHidden="1" w:unhideWhenUsed="1"/>
     <w:lsdException w:name="Table Subtle 2" w:semiHidden="1" w:unhideWhenUsed="1"/>
     <w:lsdException w:name="Table Web 1" w:semiHidden="1" w:unhideWhenUsed="1"/>
-    <w:lsdException w:name="Table Web 2" w:semiHidden="1" w:unhideWhenUsed="1"/>
-    <w:lsdException w:name="Table Web 3" w:semiHidden="1" w:unhideWhenUsed="1"/>
     <w:lsdException w:name="Balloon Text" w:semiHidden="1" w:unhideWhenUsed="1"/>
     <w:lsdException w:name="Table Grid" w:uiPriority="39"/>
     <w:lsdException w:name="Table Theme" w:semiHidden="1" w:unhideWhenUsed="1"/>
@@ -2401,6 +2531,11 @@
     <w:lsdException w:name="List Table 5 Dark Accent 6" w:uiPriority="50"/>
     <w:lsdException w:name="List Table 6 Colorful Accent 6" w:uiPriority="51"/>
     <w:lsdException w:name="List Table 7 Colorful Accent 6" w:uiPriority="52"/>
+    <w:lsdException w:name="Mention" w:semiHidden="1" w:unhideWhenUsed="1"/>
+    <w:lsdException w:name="Smart Hyperlink" w:semiHidden="1" w:unhideWhenUsed="1"/>
+    <w:lsdException w:name="Hashtag" w:semiHidden="1" w:unhideWhenUsed="1"/>
+    <w:lsdException w:name="Unresolved Mention" w:semiHidden="1" w:unhideWhenUsed="1"/>
+    <w:lsdException w:name="Smart Link" w:semiHidden="1" w:unhideWhenUsed="1"/>
   </w:latentStyles>
   <w:style w:type="paragraph" w:default="1" w:styleId="Normal">
     <w:name w:val="Normal"/>
@@ -2433,9 +2568,6 @@
     <w:semiHidden/>
     <w:unhideWhenUsed/>
   </w:style>
-  <w:style w:type="paragraph" w:customStyle="1" w:styleId="CC40523E6A9E4F12BE1FC001AD6EDE0B">
-    <w:name w:val="CC40523E6A9E4F12BE1FC001AD6EDE0B"/>
-  </w:style>
   <w:style w:type="paragraph" w:customStyle="1" w:styleId="E914DB9B81AE47DDB5A0D55CB0F3A877">
     <w:name w:val="E914DB9B81AE47DDB5A0D55CB0F3A877"/>
   </w:style>
@@ -2449,22 +2581,11 @@
       <w:color w:val="808080"/>
     </w:rPr>
   </w:style>
-  <w:style w:type="paragraph" w:customStyle="1" w:styleId="29BB6A730EFF4C39BCBEDBD76ECAB86B">
-    <w:name w:val="29BB6A730EFF4C39BCBEDBD76ECAB86B"/>
-  </w:style>
-  <w:style w:type="paragraph" w:customStyle="1" w:styleId="8F9B3AE71F424627B2C92E9D24663FF5">
-    <w:name w:val="8F9B3AE71F424627B2C92E9D24663FF5"/>
-    <w:rsid w:val="00175C27"/>
-  </w:style>
-  <w:style w:type="paragraph" w:customStyle="1" w:styleId="94467B86B9384F6097C83B9B83099123">
-    <w:name w:val="94467B86B9384F6097C83B9B83099123"/>
-    <w:rsid w:val="00175C27"/>
-  </w:style>
 </w:styles>
 </file>
 
 <file path=word/glossary/webSettings.xml><?xml version="1.0" encoding="utf-8"?>
-<w:webSettings xmlns:mc="http://schemas.openxmlformats.org/markup-compatibility/2006" xmlns:r="http://schemas.openxmlformats.org/officeDocument/2006/relationships" xmlns:w="http://schemas.openxmlformats.org/wordprocessingml/2006/main" xmlns:w14="http://schemas.microsoft.com/office/word/2010/wordml" xmlns:w15="http://schemas.microsoft.com/office/word/2012/wordml" mc:Ignorable="w14 w15">
+<w:webSettings xmlns:mc="http://schemas.openxmlformats.org/markup-compatibility/2006" xmlns:r="http://schemas.openxmlformats.org/officeDocument/2006/relationships" xmlns:w="http://schemas.openxmlformats.org/wordprocessingml/2006/main" xmlns:w14="http://schemas.microsoft.com/office/word/2010/wordml" xmlns:w15="http://schemas.microsoft.com/office/word/2012/wordml" xmlns:w16cex="http://schemas.microsoft.com/office/word/2018/wordml/cex" xmlns:w16cid="http://schemas.microsoft.com/office/word/2016/wordml/cid" xmlns:w16="http://schemas.microsoft.com/office/word/2018/wordml" xmlns:w16sdtdh="http://schemas.microsoft.com/office/word/2020/wordml/sdtdatahash" xmlns:w16se="http://schemas.microsoft.com/office/word/2015/wordml/symex" mc:Ignorable="w14 w15 w16se w16cid w16 w16cex w16sdtdh">
   <w:optimizeForBrowser/>
   <w:allowPNG/>
 </w:webSettings>
@@ -2732,6 +2853,10 @@
 </file>
 
 <file path=customXml/item1.xml><?xml version="1.0" encoding="utf-8"?>
+<b:Sources xmlns:b="http://schemas.openxmlformats.org/officeDocument/2006/bibliography" SelectedStyle="\apasixtheditionofficeonline.xsl" StyleName="APA" Version="6"/>
+</file>
+
+<file path=customXml/item2.xml><?xml version="1.0" encoding="utf-8"?>
 <?mso-contentType ?>
 <FormTemplates xmlns="http://schemas.microsoft.com/sharepoint/v3/contenttype/forms">
   <Display>DocumentLibraryForm</Display>
@@ -2740,22 +2865,18 @@
 </FormTemplates>
 </file>
 
-<file path=customXml/item2.xml><?xml version="1.0" encoding="utf-8"?>
-<b:Sources xmlns:b="http://schemas.openxmlformats.org/officeDocument/2006/bibliography" SelectedStyle="\apasixtheditionofficeonline.xsl" StyleName="APA" Version="6"/>
+<file path=customXml/itemProps1.xml><?xml version="1.0" encoding="utf-8"?>
+<ds:datastoreItem xmlns:ds="http://schemas.openxmlformats.org/officeDocument/2006/customXml" ds:itemID="{8F51884E-601D-4556-87E1-DBE53F19A528}">
+  <ds:schemaRefs>
+    <ds:schemaRef ds:uri="http://schemas.openxmlformats.org/officeDocument/2006/bibliography"/>
+  </ds:schemaRefs>
+</ds:datastoreItem>
 </file>
 
-<file path=customXml/itemProps1.xml><?xml version="1.0" encoding="utf-8"?>
+<file path=customXml/itemProps2.xml><?xml version="1.0" encoding="utf-8"?>
 <ds:datastoreItem xmlns:ds="http://schemas.openxmlformats.org/officeDocument/2006/customXml" ds:itemID="{EE371770-17E6-4153-B66C-5ABDCB7E1816}">
   <ds:schemaRefs>
     <ds:schemaRef ds:uri="http://schemas.microsoft.com/sharepoint/v3/contenttype/forms"/>
   </ds:schemaRefs>
 </ds:datastoreItem>
-</file>
-
-<file path=customXml/itemProps2.xml><?xml version="1.0" encoding="utf-8"?>
-<ds:datastoreItem xmlns:ds="http://schemas.openxmlformats.org/officeDocument/2006/customXml" ds:itemID="{8F51884E-601D-4556-87E1-DBE53F19A528}">
-  <ds:schemaRefs>
-    <ds:schemaRef ds:uri="http://schemas.openxmlformats.org/officeDocument/2006/bibliography"/>
-  </ds:schemaRefs>
-</ds:datastoreItem>
 </file>
</xml_diff>